<commit_message>
Mac: new prices, CMYK bleed fix, WeTransfer/Box/iCloud links
Prices from 2026-10-21: separator sheet $0.20, hole punch/staple +$0.01/page (counter sheets rebuilt).
impose/crushcheck/verify_print: CMYK pages bleed through Ghostscript, rotated bleed strips fixed, new continuity check.
fetch_links: WeTransfer, Box and iCloud Drive links.
Tests: Mac's CMYK, fitpage and link tests added to the runner (60 PASS on the Mac).

Co-Authored-By: Claude Opus 5.5 <noreply@anthropic.com>
</commit_message>
<xml_diff>
--- a/PriceBook/Counter Sheets/Rainbow_Sheet_03_ComputerServices.docx
+++ b/PriceBook/Counter Sheets/Rainbow_Sheet_03_ComputerServices.docx
@@ -1360,6 +1360,20 @@
         </w:tc>
       </w:tr>
     </w:tbl>
+    <w:p>
+      <w:pPr>
+        <w:spacing w:before="20" w:after="0"/>
+        <w:jc w:val="center"/>
+      </w:pPr>
+      <w:r>
+        <w:rPr>
+          <w:rFonts w:ascii="Arial" w:hAnsi="Arial" w:cs="Arial" w:eastAsia="Arial"/>
+          <w:b/>
+          <w:sz w:val="20"/>
+        </w:rPr>
+        <w:t>Hole punching or stapling: add .01 per page to the copy charge</w:t>
+      </w:r>
+    </w:p>
     <w:tbl>
       <w:tblPr>
         <w:tblW w:type="dxa" w:w="10800"/>
@@ -1393,7 +1407,7 @@
           </w:tcPr>
           <w:p>
             <w:pPr>
-              <w:spacing w:before="100"/>
+              <w:spacing w:before="60"/>
               <w:jc w:val="center"/>
             </w:pPr>
             <w:r>
@@ -1787,7 +1801,7 @@
           </w:tcPr>
           <w:p>
             <w:pPr>
-              <w:spacing w:before="100"/>
+              <w:spacing w:before="60"/>
               <w:jc w:val="center"/>
             </w:pPr>
             <w:r>
@@ -2194,7 +2208,7 @@
         <w:color w:val="666666"/>
         <w:sz w:val="12"/>
       </w:rPr>
-      <w:t>Rev. 2026-10-17</w:t>
+      <w:t>Rev. 2026-10-21</w:t>
     </w:r>
   </w:p>
 </w:ftr>

</xml_diff>